<commit_message>
Final Push. God knows I worked hard for this
</commit_message>
<xml_diff>
--- a/documents/References.docx
+++ b/documents/References.docx
@@ -14,7 +14,13 @@
     <w:p>
       <w:bookmarkStart w:id="2" w:name="_Toc229316242"/>
       <w:r>
-        <w:t>Adedeji, F. (2021). The indigenous music of Christ Apostolic Church in Nigeria and the diasporas: A proof of Christian transformative musicality. African Musicology Online, 7(1). </w:t>
+        <w:t>F.</w:t>
+      </w:r>
+      <w:r>
+        <w:t xml:space="preserve"> </w:t>
+      </w:r>
+      <w:r>
+        <w:t>Adedeji, (2021). The indigenous music of Christ Apostolic Church in Nigeria and the diasporas: A proof of Christian transformative musicality. African Musicology Online, 7(1). </w:t>
       </w:r>
       <w:hyperlink r:id="rId7" w:history="1">
         <w:r>
@@ -31,8 +37,29 @@
           <w:lang w:val="de-DE"/>
         </w:rPr>
       </w:pPr>
-      <w:r>
-        <w:t>Adedibu, B. A., &amp; Igboin, B. O. (2019). Eschato-praxis and accountability: A study of Neo-African Pentecostal movement in the light of prosperity gospel. </w:t>
+      <w:proofErr w:type="spellStart"/>
+      <w:r>
+        <w:t>Adedibu</w:t>
+      </w:r>
+      <w:proofErr w:type="spellEnd"/>
+      <w:r>
+        <w:t xml:space="preserve">, B. A., &amp; </w:t>
+      </w:r>
+      <w:proofErr w:type="spellStart"/>
+      <w:r>
+        <w:t>Igboin</w:t>
+      </w:r>
+      <w:proofErr w:type="spellEnd"/>
+      <w:r>
+        <w:t xml:space="preserve">, B. O. (2019). </w:t>
+      </w:r>
+      <w:proofErr w:type="spellStart"/>
+      <w:r>
+        <w:t>Eschato</w:t>
+      </w:r>
+      <w:proofErr w:type="spellEnd"/>
+      <w:r>
+        <w:t>-praxis and accountability: A study of Neo-African Pentecostal movement in the light of prosperity gospel. </w:t>
       </w:r>
       <w:r>
         <w:rPr>
@@ -40,28 +67,15 @@
         </w:rPr>
         <w:t xml:space="preserve">Verbum et Ecclesia, 40(1), 1-8. </w:t>
       </w:r>
-      <w:r>
-        <w:fldChar w:fldCharType="begin"/>
-      </w:r>
-      <w:r>
-        <w:rPr>
-          <w:lang w:val="de-DE"/>
-        </w:rPr>
-        <w:instrText>HYPERLINK "https://doi.org/10.4102/ve.v40i1.1987"</w:instrText>
-      </w:r>
-      <w:r>
-        <w:fldChar w:fldCharType="separate"/>
-      </w:r>
-      <w:r>
-        <w:rPr>
-          <w:rStyle w:val="Hyperlink"/>
-          <w:lang w:val="de-DE"/>
-        </w:rPr>
-        <w:t>https://doi.org/10.4102/ve.v40i1.1987</w:t>
-      </w:r>
-      <w:r>
-        <w:fldChar w:fldCharType="end"/>
-      </w:r>
+      <w:hyperlink r:id="rId8" w:history="1">
+        <w:r>
+          <w:rPr>
+            <w:rStyle w:val="Hyperlink"/>
+            <w:lang w:val="de-DE"/>
+          </w:rPr>
+          <w:t>https://doi.org/10.4102/ve.v40i1.1987</w:t>
+        </w:r>
+      </w:hyperlink>
     </w:p>
     <w:p>
       <w:r>
@@ -73,7 +87,7 @@
       <w:r>
         <w:t>Exploring the Paradigmatic Thinking and Representation in RE Obeng’s Eighteenpence: Beyond Plot. English Language, Literature &amp; Culture, 4(3), 61-69. </w:t>
       </w:r>
-      <w:hyperlink r:id="rId8" w:history="1">
+      <w:hyperlink r:id="rId9" w:history="1">
         <w:r>
           <w:rPr>
             <w:rStyle w:val="Hyperlink"/>
@@ -86,7 +100,7 @@
       <w:r>
         <w:t xml:space="preserve">Afzal, A., Khalil, K., &amp; Saleem, W. (2024). Unveiling the Obstacles: Understanding Data Collection Challenges for Researchers in Pakistani Universities. Journal of Asian Development Studies, 13(1), 115-131. </w:t>
       </w:r>
-      <w:hyperlink r:id="rId9" w:history="1">
+      <w:hyperlink r:id="rId10" w:history="1">
         <w:r>
           <w:rPr>
             <w:rStyle w:val="Hyperlink"/>
@@ -96,10 +110,32 @@
       </w:hyperlink>
     </w:p>
     <w:p>
-      <w:r>
-        <w:t>Ahmadi, M., Zaree, K., Leily, A., &amp; Hoseini, A. (2018). Efficacy of a written prayer technique on the anxiety of mothers of children with cancer. Palliative and Supportive Care, 17, 54-59. </w:t>
-      </w:r>
-      <w:hyperlink r:id="rId10" w:history="1">
+      <w:proofErr w:type="spellStart"/>
+      <w:r>
+        <w:t>Zaree</w:t>
+      </w:r>
+      <w:proofErr w:type="spellEnd"/>
+      <w:r>
+        <w:t>, K.,</w:t>
+      </w:r>
+      <w:r>
+        <w:t xml:space="preserve"> </w:t>
+      </w:r>
+      <w:r>
+        <w:t>Ahmadi, M.,</w:t>
+      </w:r>
+      <w:r>
+        <w:t xml:space="preserve"> Leily, A., &amp; </w:t>
+      </w:r>
+      <w:proofErr w:type="spellStart"/>
+      <w:r>
+        <w:t>Hoseini</w:t>
+      </w:r>
+      <w:proofErr w:type="spellEnd"/>
+      <w:r>
+        <w:t>, A. (2018). Efficacy of a written prayer technique on the anxiety of mothers of children with cancer. Palliative and Supportive Care, 17, 54-59. </w:t>
+      </w:r>
+      <w:hyperlink r:id="rId11" w:history="1">
         <w:r>
           <w:rPr>
             <w:rStyle w:val="Hyperlink"/>
@@ -110,9 +146,17 @@
     </w:p>
     <w:p>
       <w:r>
-        <w:t>Akano, B. (2022). Mentoring as an Effective Strategy for Leadership Development in Contemporary African Pentecostalism. Pentecostalism. Charismaticism and Neo-Prophetic Movements Journal. </w:t>
-      </w:r>
-      <w:hyperlink r:id="rId11" w:history="1">
+        <w:t>Akano, B. (2022). Mentoring as an Effective Strategy for Leadership Development in Contemporary African Pentecostalism. Pentecostalism. </w:t>
+      </w:r>
+      <w:proofErr w:type="spellStart"/>
+      <w:r>
+        <w:t>Charismaticism</w:t>
+      </w:r>
+      <w:proofErr w:type="spellEnd"/>
+      <w:r>
+        <w:t xml:space="preserve"> and Neo-Prophetic Movements Journal. </w:t>
+      </w:r>
+      <w:hyperlink r:id="rId12" w:history="1">
         <w:r>
           <w:rPr>
             <w:rStyle w:val="Hyperlink"/>
@@ -131,7 +175,7 @@
       <w:r>
         <w:t>Pentecostal Spirituality. In J. C. M. Robeck &amp; A. Yong (Eds.), The Cambridge Companion to Pentecostalism (pp. 235-253). Cambridge University Press. </w:t>
       </w:r>
-      <w:hyperlink r:id="rId12" w:history="1">
+      <w:hyperlink r:id="rId13" w:history="1">
         <w:r>
           <w:rPr>
             <w:rStyle w:val="Hyperlink"/>
@@ -147,7 +191,7 @@
       <w:r>
         <w:t>Alessi, E. J., &amp; Kahn, S. (2023). Toward a trauma-informed qualitative research approach: Guidelines for ensuring the safety and promoting the resilience of research participants. Qualitative Research in Psychology, 20(1), 121-154. </w:t>
       </w:r>
-      <w:hyperlink r:id="rId13" w:history="1">
+      <w:hyperlink r:id="rId14" w:history="1">
         <w:r>
           <w:rPr>
             <w:rStyle w:val="Hyperlink"/>
@@ -160,7 +204,7 @@
       <w:r>
         <w:t xml:space="preserve">Allen, P. (2022). Film as a pedagogical tool for trauma-and resiliency-informed theology and liturgy. In Racialized health, COVID-19, and religious responses (pp. 215–224). Routledge. </w:t>
       </w:r>
-      <w:hyperlink r:id="rId14" w:tgtFrame="_new" w:history="1">
+      <w:hyperlink r:id="rId15" w:tgtFrame="_new" w:history="1">
         <w:r>
           <w:rPr>
             <w:rStyle w:val="Hyperlink"/>
@@ -173,7 +217,7 @@
       <w:r>
         <w:t xml:space="preserve">Allotey, J. (2022). Increasing mental health literacy in the Black Church. </w:t>
       </w:r>
-      <w:hyperlink r:id="rId15" w:tgtFrame="_new" w:history="1">
+      <w:hyperlink r:id="rId16" w:tgtFrame="_new" w:history="1">
         <w:r>
           <w:rPr>
             <w:rStyle w:val="Hyperlink"/>
@@ -186,7 +230,7 @@
       <w:r>
         <w:t xml:space="preserve">Alt, D., &amp; Raichel, N. (2020). Reflective journaling and metacognitive awareness: Insights from a longitudinal study in higher education. Reflective Practice, 21(2), 145–158. </w:t>
       </w:r>
-      <w:hyperlink r:id="rId16" w:tgtFrame="_new" w:history="1">
+      <w:hyperlink r:id="rId17" w:tgtFrame="_new" w:history="1">
         <w:r>
           <w:rPr>
             <w:rStyle w:val="Hyperlink"/>
@@ -199,7 +243,7 @@
       <w:r>
         <w:t xml:space="preserve">Althouse, P. (2023). Inner healing, embodied emotions, and the therapeutic culture of Christian healing ministries: SPS presidential address 2023. Pneuma, 45(2), 177–199. </w:t>
       </w:r>
-      <w:hyperlink r:id="rId17" w:tgtFrame="_new" w:history="1">
+      <w:hyperlink r:id="rId18" w:tgtFrame="_new" w:history="1">
         <w:r>
           <w:rPr>
             <w:rStyle w:val="Hyperlink"/>
@@ -210,9 +254,17 @@
     </w:p>
     <w:p>
       <w:r>
-        <w:t xml:space="preserve">Ananda, M. O., Harun, M. H. M., Tan, P. L., Sharkawi, S., &amp; Saad, S. (2024). Hybrid quantitative questionnaire with open-ended questions for rapid analysis and qualitative research publication: A conceptual paper. International Journal of Advanced Research in Education and Society, 6(2), 152–156. </w:t>
-      </w:r>
-      <w:hyperlink r:id="rId18" w:tgtFrame="_new" w:history="1">
+        <w:t xml:space="preserve">Ananda, M. O., Harun, M. H. M., Tan, P. L., </w:t>
+      </w:r>
+      <w:proofErr w:type="spellStart"/>
+      <w:r>
+        <w:t>Sharkawi</w:t>
+      </w:r>
+      <w:proofErr w:type="spellEnd"/>
+      <w:r>
+        <w:t xml:space="preserve">, S., &amp; Saad, S. (2024). Hybrid quantitative questionnaire with open-ended questions for rapid analysis and qualitative research publication: A conceptual paper. International Journal of Advanced Research in Education and Society, 6(2), 152–156. </w:t>
+      </w:r>
+      <w:hyperlink r:id="rId19" w:tgtFrame="_new" w:history="1">
         <w:r>
           <w:rPr>
             <w:rStyle w:val="Hyperlink"/>
@@ -230,7 +282,7 @@
       <w:r>
         <w:t xml:space="preserve">Anderson, K. J. (2020). A place for authentic spirit: Building and sustaining a "beloved community" for spiritual transformation outside the church. Journal of Communication &amp; Religion, 43(3). </w:t>
       </w:r>
-      <w:hyperlink r:id="rId19" w:tgtFrame="_new" w:history="1">
+      <w:hyperlink r:id="rId20" w:tgtFrame="_new" w:history="1">
         <w:r>
           <w:rPr>
             <w:rStyle w:val="Hyperlink"/>
@@ -244,7 +296,7 @@
         <w:lastRenderedPageBreak/>
         <w:t xml:space="preserve">Apata, G. (2021). How Pentecostalism emerged as a form of resistance to racial oppression in the US. Culture and Religion, 22(1), 46–63. </w:t>
       </w:r>
-      <w:hyperlink r:id="rId20" w:tgtFrame="_new" w:history="1">
+      <w:hyperlink r:id="rId21" w:tgtFrame="_new" w:history="1">
         <w:r>
           <w:rPr>
             <w:rStyle w:val="Hyperlink"/>
@@ -254,10 +306,15 @@
       </w:hyperlink>
     </w:p>
     <w:p>
-      <w:r>
-        <w:t xml:space="preserve">Appau, S., &amp; Churchill, S. (2019). Bridging cultural categories of consumption through indeterminacy: A consumer culture perspective on the rise of African Pentecostal-Charismatic Christianity. Journal of Consumer Culture, 19(1), 125–145. </w:t>
-      </w:r>
-      <w:hyperlink r:id="rId21" w:tgtFrame="_new" w:history="1">
+      <w:proofErr w:type="spellStart"/>
+      <w:r>
+        <w:t>Appau</w:t>
+      </w:r>
+      <w:proofErr w:type="spellEnd"/>
+      <w:r>
+        <w:t xml:space="preserve">, S., &amp; Churchill, S. (2019). Bridging cultural categories of consumption through indeterminacy: A consumer culture perspective on the rise of African Pentecostal-Charismatic Christianity. Journal of Consumer Culture, 19(1), 125–145. </w:t>
+      </w:r>
+      <w:hyperlink r:id="rId22" w:tgtFrame="_new" w:history="1">
         <w:r>
           <w:rPr>
             <w:rStyle w:val="Hyperlink"/>
@@ -270,7 +327,7 @@
       <w:r>
         <w:t xml:space="preserve">Armstrong-Mensah, E., Bills, R., &amp; Reyes, L. (2020). Culture, depression, and coping mechanisms among African Americans. Research in Health Science, 5(3), 102. </w:t>
       </w:r>
-      <w:hyperlink r:id="rId22" w:tgtFrame="_new" w:history="1">
+      <w:hyperlink r:id="rId23" w:tgtFrame="_new" w:history="1">
         <w:r>
           <w:rPr>
             <w:rStyle w:val="Hyperlink"/>
@@ -283,7 +340,7 @@
       <w:r>
         <w:t xml:space="preserve">Armstrong-Mensah, E., Patel, H., Parekh, P., &amp; Lee, C. (2020). Mental health inequities and disparities among African American adults in the United States. Research in Health Science, 5(3), 23. </w:t>
       </w:r>
-      <w:hyperlink r:id="rId23" w:tgtFrame="_new" w:history="1">
+      <w:hyperlink r:id="rId24" w:tgtFrame="_new" w:history="1">
         <w:r>
           <w:rPr>
             <w:rStyle w:val="Hyperlink"/>
@@ -296,7 +353,7 @@
       <w:r>
         <w:t>Avent, J., &amp; Cashwell, C. (2015). The Black Church: Theology and Implications for Counseling African Americans. The Professional Counselor, 5, 81-90. </w:t>
       </w:r>
-      <w:hyperlink r:id="rId24" w:history="1">
+      <w:hyperlink r:id="rId25" w:history="1">
         <w:r>
           <w:rPr>
             <w:rStyle w:val="Hyperlink"/>
@@ -309,7 +366,7 @@
       <w:r>
         <w:t>Banfield, L. (2019). Fostering spiritual resilience and vitality in formerly incarcerated persons of African American descent. Journal of Pastoral Care &amp; Counseling, 73, 222-231. </w:t>
       </w:r>
-      <w:hyperlink r:id="rId25" w:history="1">
+      <w:hyperlink r:id="rId26" w:history="1">
         <w:r>
           <w:rPr>
             <w:rStyle w:val="Hyperlink"/>
@@ -322,7 +379,7 @@
       <w:r>
         <w:t>Barclay, D. (2020). An Analyst Has a Birthday - Can Forgiveness Heal? Psychoanalytic Dialogues, 30, 19-31. </w:t>
       </w:r>
-      <w:hyperlink r:id="rId26" w:history="1">
+      <w:hyperlink r:id="rId27" w:history="1">
         <w:r>
           <w:rPr>
             <w:rStyle w:val="Hyperlink"/>
@@ -333,9 +390,25 @@
     </w:p>
     <w:p>
       <w:r>
-        <w:t>Barrett-Rodger, L., Goldspink, S., &amp; Engward, H. (2022). Being in the wood: Using a presuppositional interview in hermeneutic phenomenological research. Qualitative Research, 23, 1062-1077. </w:t>
-      </w:r>
-      <w:hyperlink r:id="rId27" w:history="1">
+        <w:t xml:space="preserve">Barrett-Rodger, L., </w:t>
+      </w:r>
+      <w:proofErr w:type="spellStart"/>
+      <w:r>
+        <w:t>Goldspink</w:t>
+      </w:r>
+      <w:proofErr w:type="spellEnd"/>
+      <w:r>
+        <w:t xml:space="preserve">, S., &amp; </w:t>
+      </w:r>
+      <w:proofErr w:type="spellStart"/>
+      <w:r>
+        <w:t>Engward</w:t>
+      </w:r>
+      <w:proofErr w:type="spellEnd"/>
+      <w:r>
+        <w:t>, H. (2022). Being in the wood: Using a presuppositional interview in hermeneutic phenomenological research. Qualitative Research, 23, 1062-1077. </w:t>
+      </w:r>
+      <w:hyperlink r:id="rId28" w:history="1">
         <w:r>
           <w:rPr>
             <w:rStyle w:val="Hyperlink"/>
@@ -346,9 +419,17 @@
     </w:p>
     <w:p>
       <w:r>
-        <w:t xml:space="preserve"> Bauer, A. G., Pean, K., Lalwani, T., Julien, L., &amp; Shevorykin, A. (2022). Community needs and recommendations for multilevel mental health interventions among young Black men with previous trauma exposure. Journal of Consulting and Clinical Psychology, 90(10), 760-769. </w:t>
-      </w:r>
-      <w:hyperlink r:id="rId28" w:history="1">
+        <w:t xml:space="preserve"> Bauer, A. G., Pean, K., Lalwani, T., Julien, L., &amp; </w:t>
+      </w:r>
+      <w:proofErr w:type="spellStart"/>
+      <w:r>
+        <w:t>Shevorykin</w:t>
+      </w:r>
+      <w:proofErr w:type="spellEnd"/>
+      <w:r>
+        <w:t>, A. (2022). Community needs and recommendations for multilevel mental health interventions among young Black men with previous trauma exposure. Journal of Consulting and Clinical Psychology, 90(10), 760-769. </w:t>
+      </w:r>
+      <w:hyperlink r:id="rId29" w:history="1">
         <w:r>
           <w:rPr>
             <w:rStyle w:val="Hyperlink"/>
@@ -363,10 +444,15 @@
       </w:r>
     </w:p>
     <w:p>
-      <w:r>
-        <w:t>Bilkins, B., Allen, A., Davey, M. P., &amp; Davey, A. (2016). Black church leaders’ attitudes about mental health services: Role of racial discrimination. Contemporary Family Therapy, 38, 184-197. </w:t>
-      </w:r>
-      <w:hyperlink r:id="rId29" w:history="1">
+      <w:proofErr w:type="spellStart"/>
+      <w:r>
+        <w:t>Bilkins</w:t>
+      </w:r>
+      <w:proofErr w:type="spellEnd"/>
+      <w:r>
+        <w:t>, B., Allen, A., Davey, M. P., &amp; Davey, A. (2016). Black church leaders’ attitudes about mental health services: Role of racial discrimination. Contemporary Family Therapy, 38, 184-197. </w:t>
+      </w:r>
+      <w:hyperlink r:id="rId30" w:history="1">
         <w:r>
           <w:rPr>
             <w:rStyle w:val="Hyperlink"/>
@@ -379,7 +465,7 @@
       <w:r>
         <w:t>Bodak, V. (2019). The interaction of culture and religion in the context of the present: The philosophical-cultural content. In Comprehension of the formation of the world in different philosophical approaches. </w:t>
       </w:r>
-      <w:hyperlink r:id="rId30" w:history="1">
+      <w:hyperlink r:id="rId31" w:history="1">
         <w:r>
           <w:rPr>
             <w:rStyle w:val="Hyperlink"/>
@@ -392,7 +478,7 @@
       <w:r>
         <w:t xml:space="preserve">Bolger, D., &amp; Prickett, P. J. (2021). Where would you go? Race, religion, and the limits of pastor mental health care in Black and Latino congregations. Religions, 12(12), 1062. </w:t>
       </w:r>
-      <w:hyperlink r:id="rId31" w:history="1">
+      <w:hyperlink r:id="rId32" w:history="1">
         <w:r>
           <w:rPr>
             <w:rStyle w:val="Hyperlink"/>
@@ -403,9 +489,57 @@
     </w:p>
     <w:p>
       <w:r>
-        <w:t>Bošnjaković, J. (2022). Vulnerability of the Church through abuse of power, body and conscience. Nova prisutnost: časopis za intelektualna i duhovna pitanja, 20(2), 287-302. </w:t>
-      </w:r>
-      <w:hyperlink r:id="rId32" w:history="1">
+        <w:t xml:space="preserve">Bošnjaković, J. (2022). Vulnerability of the Church through abuse of power, body and conscience. Nova </w:t>
+      </w:r>
+      <w:proofErr w:type="spellStart"/>
+      <w:r>
+        <w:t>prisutnost</w:t>
+      </w:r>
+      <w:proofErr w:type="spellEnd"/>
+      <w:r>
+        <w:t xml:space="preserve">: </w:t>
+      </w:r>
+      <w:proofErr w:type="spellStart"/>
+      <w:r>
+        <w:t>časopis</w:t>
+      </w:r>
+      <w:proofErr w:type="spellEnd"/>
+      <w:r>
+        <w:t xml:space="preserve"> za </w:t>
+      </w:r>
+      <w:proofErr w:type="spellStart"/>
+      <w:r>
+        <w:t>intelektualna</w:t>
+      </w:r>
+      <w:proofErr w:type="spellEnd"/>
+      <w:r>
+        <w:t xml:space="preserve"> </w:t>
+      </w:r>
+      <w:proofErr w:type="spellStart"/>
+      <w:r>
+        <w:t>i</w:t>
+      </w:r>
+      <w:proofErr w:type="spellEnd"/>
+      <w:r>
+        <w:t xml:space="preserve"> </w:t>
+      </w:r>
+      <w:proofErr w:type="spellStart"/>
+      <w:r>
+        <w:t>duhovna</w:t>
+      </w:r>
+      <w:proofErr w:type="spellEnd"/>
+      <w:r>
+        <w:t xml:space="preserve"> </w:t>
+      </w:r>
+      <w:proofErr w:type="spellStart"/>
+      <w:r>
+        <w:t>pitanja</w:t>
+      </w:r>
+      <w:proofErr w:type="spellEnd"/>
+      <w:r>
+        <w:t>, 20(2), 287-302. </w:t>
+      </w:r>
+      <w:hyperlink r:id="rId33" w:history="1">
         <w:r>
           <w:rPr>
             <w:rStyle w:val="Hyperlink"/>
@@ -415,10 +549,23 @@
       </w:hyperlink>
     </w:p>
     <w:p>
-      <w:r>
-        <w:t xml:space="preserve">Bożek, A., Nowak, P. F., &amp; Blukacz, M. (2020). The relationship between spirituality, health-related behavior, and psychological well-being. Frontiers in psychology, 11, 1997. </w:t>
-      </w:r>
-      <w:hyperlink r:id="rId33" w:history="1">
+      <w:proofErr w:type="spellStart"/>
+      <w:r>
+        <w:t>Bożek</w:t>
+      </w:r>
+      <w:proofErr w:type="spellEnd"/>
+      <w:r>
+        <w:t xml:space="preserve">, A., Nowak, P. F., &amp; </w:t>
+      </w:r>
+      <w:proofErr w:type="spellStart"/>
+      <w:r>
+        <w:t>Blukacz</w:t>
+      </w:r>
+      <w:proofErr w:type="spellEnd"/>
+      <w:r>
+        <w:t xml:space="preserve">, M. (2020). The relationship between spirituality, health-related behavior, and psychological well-being. Frontiers in psychology, 11, 1997. </w:t>
+      </w:r>
+      <w:hyperlink r:id="rId34" w:history="1">
         <w:r>
           <w:rPr>
             <w:rStyle w:val="Hyperlink"/>
@@ -430,9 +577,17 @@
     <w:p>
       <w:r>
         <w:lastRenderedPageBreak/>
-        <w:t>Brémault-Phillips, S., Pike, A., Scarcella, F., &amp; Cherwick, T. (2019). Spirituality and moral injury among military personnel: A mini-review. Frontiers in Psychiatry, 10. </w:t>
-      </w:r>
-      <w:hyperlink r:id="rId34" w:history="1">
+        <w:t xml:space="preserve">Brémault-Phillips, S., Pike, A., Scarcella, F., &amp; </w:t>
+      </w:r>
+      <w:proofErr w:type="spellStart"/>
+      <w:r>
+        <w:t>Cherwick</w:t>
+      </w:r>
+      <w:proofErr w:type="spellEnd"/>
+      <w:r>
+        <w:t>, T. (2019). Spirituality and moral injury among military personnel: A mini-review. Frontiers in Psychiatry, 10. </w:t>
+      </w:r>
+      <w:hyperlink r:id="rId35" w:history="1">
         <w:r>
           <w:rPr>
             <w:rStyle w:val="Hyperlink"/>
@@ -443,7 +598,23 @@
     </w:p>
     <w:p>
       <w:r>
-        <w:t>Briska, S. M. (2023). Power and authority anchored on christ’s leadership style: It’s Impact on deconstructing misleading theologies in pastoral ministry in North-Eastern nigeria.</w:t>
+        <w:t xml:space="preserve">Briska, S. M. (2023). Power and authority anchored on </w:t>
+      </w:r>
+      <w:proofErr w:type="spellStart"/>
+      <w:r>
+        <w:t>christ’s</w:t>
+      </w:r>
+      <w:proofErr w:type="spellEnd"/>
+      <w:r>
+        <w:t xml:space="preserve"> leadership style: It’s Impact on deconstructing misleading theologies in pastoral ministry in North-Eastern </w:t>
+      </w:r>
+      <w:proofErr w:type="spellStart"/>
+      <w:r>
+        <w:t>nigeria</w:t>
+      </w:r>
+      <w:proofErr w:type="spellEnd"/>
+      <w:r>
+        <w:t>.</w:t>
       </w:r>
     </w:p>
     <w:p>
@@ -455,7 +626,7 @@
       <w:r>
         <w:t>Bruk, A., Scholl, S., &amp; Bless, H. (2021). You and I Both: Self-Compassion Reduces Self–Other Differences in Evaluation of Showing Vulnerability. Personality &amp; Social Psychology Bulletin, 48, 1054-1067. </w:t>
       </w:r>
-      <w:hyperlink r:id="rId35" w:history="1">
+      <w:hyperlink r:id="rId36" w:history="1">
         <w:r>
           <w:rPr>
             <w:rStyle w:val="Hyperlink"/>
@@ -520,7 +691,7 @@
       <w:r>
         <w:t xml:space="preserve"> Governing Research Through Informed Consent Procedures. International Journal of Qualitative Methods, 22. </w:t>
       </w:r>
-      <w:hyperlink r:id="rId36" w:history="1">
+      <w:hyperlink r:id="rId37" w:history="1">
         <w:r>
           <w:rPr>
             <w:rStyle w:val="Hyperlink"/>
@@ -533,7 +704,7 @@
       <w:r>
         <w:t>Campbell, A. D. (2021). Clergy perceptions of mental illness and confronting stigma in congregations. Religions, 12(12), 1110. </w:t>
       </w:r>
-      <w:hyperlink r:id="rId37" w:history="1">
+      <w:hyperlink r:id="rId38" w:history="1">
         <w:r>
           <w:rPr>
             <w:rStyle w:val="Hyperlink"/>
@@ -546,7 +717,7 @@
       <w:r>
         <w:t>Campbell, R. D., &amp; Littleton, T. (2018). Mental health counseling in the Black American church: Reflections and recommendations from counselors serving in a counseling ministry. Mental Health, Religion &amp; Culture, 21(4), 336-352. </w:t>
       </w:r>
-      <w:hyperlink r:id="rId38" w:history="1">
+      <w:hyperlink r:id="rId39" w:history="1">
         <w:r>
           <w:rPr>
             <w:rStyle w:val="Hyperlink"/>
@@ -567,7 +738,7 @@
       <w:r>
         <w:t xml:space="preserve"> how the Black Church can address mental health with Black Americans. Social Work &amp; Christianity, 47(2), 105-122. </w:t>
       </w:r>
-      <w:hyperlink r:id="rId39" w:history="1">
+      <w:hyperlink r:id="rId40" w:history="1">
         <w:r>
           <w:rPr>
             <w:rStyle w:val="Hyperlink"/>
@@ -582,8 +753,13 @@
           <w:lang w:val="de-DE"/>
         </w:rPr>
       </w:pPr>
-      <w:r>
-        <w:t>Captari, L. E., Sandage, S. J., &amp; Vandiver, R. A. (2022). Spiritually integrated psychotherapies in real-world clinical practice: Synthesizing the literature to identify best practices and future research directions. </w:t>
+      <w:proofErr w:type="spellStart"/>
+      <w:r>
+        <w:t>Captari</w:t>
+      </w:r>
+      <w:proofErr w:type="spellEnd"/>
+      <w:r>
+        <w:t>, L. E., Sandage, S. J., &amp; Vandiver, R. A. (2022). Spiritually integrated psychotherapies in real-world clinical practice: Synthesizing the literature to identify best practices and future research directions. </w:t>
       </w:r>
       <w:r>
         <w:rPr>
@@ -591,15 +767,28 @@
         </w:rPr>
         <w:t>Psychotherapy, 59(3), 307. </w:t>
       </w:r>
-      <w:hyperlink r:id="rId40" w:history="1">
-        <w:r>
-          <w:rPr>
-            <w:rStyle w:val="Hyperlink"/>
-            <w:lang w:val="de-DE"/>
-          </w:rPr>
-          <w:t>https://doi.org/10.1037/pst0000407</w:t>
-        </w:r>
-      </w:hyperlink>
+      <w:r>
+        <w:fldChar w:fldCharType="begin"/>
+      </w:r>
+      <w:r>
+        <w:rPr>
+          <w:lang w:val="de-DE"/>
+        </w:rPr>
+        <w:instrText>HYPERLINK "https://doi.org/10.1037/pst0000407"</w:instrText>
+      </w:r>
+      <w:r>
+        <w:fldChar w:fldCharType="separate"/>
+      </w:r>
+      <w:r>
+        <w:rPr>
+          <w:rStyle w:val="Hyperlink"/>
+          <w:lang w:val="de-DE"/>
+        </w:rPr>
+        <w:t>https://doi.org/10.1037/pst0000407</w:t>
+      </w:r>
+      <w:r>
+        <w:fldChar w:fldCharType="end"/>
+      </w:r>
     </w:p>
     <w:p>
       <w:r>
@@ -640,7 +829,23 @@
         </w:rPr>
       </w:pPr>
       <w:r>
-        <w:t>Castillo, E., Ijadi-Maghsoodi, R., Shadravan, S., Moore, E., Mensah, M., Docherty, M., &amp; Wells, K. (2019). Community Interventions to Promote Mental Health and Social Equity. Current Psychiatry Reports, 21. </w:t>
+        <w:t xml:space="preserve">Castillo, E., </w:t>
+      </w:r>
+      <w:proofErr w:type="spellStart"/>
+      <w:r>
+        <w:t>Ijadi-Maghsoodi</w:t>
+      </w:r>
+      <w:proofErr w:type="spellEnd"/>
+      <w:r>
+        <w:t xml:space="preserve">, R., </w:t>
+      </w:r>
+      <w:proofErr w:type="spellStart"/>
+      <w:r>
+        <w:t>Shadravan</w:t>
+      </w:r>
+      <w:proofErr w:type="spellEnd"/>
+      <w:r>
+        <w:t>, S., Moore, E., Mensah, M., Docherty, M., &amp; Wells, K. (2019). Community Interventions to Promote Mental Health and Social Equity. Current Psychiatry Reports, 21. </w:t>
       </w:r>
       <w:hyperlink r:id="rId43" w:history="1">
         <w:r>

</xml_diff>